<commit_message>
Added Customer Feedback((2) - Uma
</commit_message>
<xml_diff>
--- a/Documents/Customer Feedback Document.docx
+++ b/Documents/Customer Feedback Document.docx
@@ -26,7 +26,7 @@
           <w:noProof/>
         </w:rPr>
         <w:drawing>
-          <wp:inline distT="0" distB="0" distL="0" distR="0" wp14:anchorId="17799449" wp14:editId="0414DDD7">
+          <wp:inline distT="0" distB="0" distL="0" distR="0" wp14:anchorId="17799449" wp14:editId="43835FB8">
             <wp:extent cx="5237018" cy="3928056"/>
             <wp:effectExtent l="0" t="0" r="1905" b="0"/>
             <wp:docPr id="1081831846" name="Picture 1"/>
@@ -87,19 +87,69 @@
           <w:rFonts w:ascii="Times New Roman" w:hAnsi="Times New Roman" w:cs="Times New Roman"/>
         </w:rPr>
       </w:pPr>
+      <w:proofErr w:type="spellStart"/>
       <w:r>
         <w:rPr>
           <w:rFonts w:ascii="Times New Roman" w:hAnsi="Times New Roman" w:cs="Times New Roman"/>
         </w:rPr>
         <w:t>Name:</w:t>
       </w:r>
-    </w:p>
-    <w:p>
-      <w:pPr>
-        <w:rPr>
-          <w:rFonts w:ascii="Times New Roman" w:hAnsi="Times New Roman" w:cs="Times New Roman"/>
-        </w:rPr>
-      </w:pPr>
+      <w:r>
+        <w:rPr>
+          <w:rFonts w:ascii="Times New Roman" w:hAnsi="Times New Roman" w:cs="Times New Roman"/>
+        </w:rPr>
+        <w:t>Ganesh</w:t>
+      </w:r>
+      <w:proofErr w:type="spellEnd"/>
+    </w:p>
+    <w:p>
+      <w:pPr>
+        <w:rPr>
+          <w:rFonts w:ascii="Times New Roman" w:hAnsi="Times New Roman" w:cs="Times New Roman"/>
+        </w:rPr>
+      </w:pPr>
+      <w:r>
+        <w:rPr>
+          <w:rFonts w:ascii="Times New Roman" w:hAnsi="Times New Roman" w:cs="Times New Roman"/>
+        </w:rPr>
+        <w:t xml:space="preserve">Shop </w:t>
+      </w:r>
+      <w:proofErr w:type="spellStart"/>
+      <w:r>
+        <w:rPr>
+          <w:rFonts w:ascii="Times New Roman" w:hAnsi="Times New Roman" w:cs="Times New Roman"/>
+        </w:rPr>
+        <w:t>Name:</w:t>
+      </w:r>
+      <w:r>
+        <w:rPr>
+          <w:rFonts w:ascii="Times New Roman" w:hAnsi="Times New Roman" w:cs="Times New Roman"/>
+        </w:rPr>
+        <w:t>Aditya</w:t>
+      </w:r>
+      <w:proofErr w:type="spellEnd"/>
+      <w:r>
+        <w:rPr>
+          <w:rFonts w:ascii="Times New Roman" w:hAnsi="Times New Roman" w:cs="Times New Roman"/>
+        </w:rPr>
+        <w:t xml:space="preserve"> juice </w:t>
+      </w:r>
+      <w:proofErr w:type="spellStart"/>
+      <w:r>
+        <w:rPr>
+          <w:rFonts w:ascii="Times New Roman" w:hAnsi="Times New Roman" w:cs="Times New Roman"/>
+        </w:rPr>
+        <w:t>center</w:t>
+      </w:r>
+      <w:proofErr w:type="spellEnd"/>
+    </w:p>
+    <w:p>
+      <w:pPr>
+        <w:rPr>
+          <w:rFonts w:ascii="Times New Roman" w:hAnsi="Times New Roman" w:cs="Times New Roman"/>
+        </w:rPr>
+      </w:pPr>
+      <w:proofErr w:type="spellStart"/>
       <w:r>
         <w:rPr>
           <w:rFonts w:ascii="Times New Roman" w:hAnsi="Times New Roman" w:cs="Times New Roman"/>
@@ -112,18 +162,32 @@
         </w:rPr>
         <w:t>:</w:t>
       </w:r>
-    </w:p>
-    <w:p>
-      <w:pPr>
-        <w:rPr>
-          <w:rFonts w:ascii="Times New Roman" w:hAnsi="Times New Roman" w:cs="Times New Roman"/>
-        </w:rPr>
-      </w:pPr>
-      <w:r>
-        <w:rPr>
-          <w:rFonts w:ascii="Times New Roman" w:hAnsi="Times New Roman" w:cs="Times New Roman"/>
-        </w:rPr>
-        <w:t>Firm</w:t>
+      <w:r>
+        <w:rPr>
+          <w:rFonts w:ascii="Times New Roman" w:hAnsi="Times New Roman" w:cs="Times New Roman"/>
+        </w:rPr>
+        <w:t>Owner</w:t>
+      </w:r>
+      <w:proofErr w:type="spellEnd"/>
+    </w:p>
+    <w:p>
+      <w:pPr>
+        <w:rPr>
+          <w:rFonts w:ascii="Times New Roman" w:hAnsi="Times New Roman" w:cs="Times New Roman"/>
+        </w:rPr>
+      </w:pPr>
+      <w:r>
+        <w:rPr>
+          <w:rFonts w:ascii="Times New Roman" w:hAnsi="Times New Roman" w:cs="Times New Roman"/>
+        </w:rPr>
+        <w:t xml:space="preserve">Business </w:t>
+      </w:r>
+      <w:proofErr w:type="spellStart"/>
+      <w:r>
+        <w:rPr>
+          <w:rFonts w:ascii="Times New Roman" w:hAnsi="Times New Roman" w:cs="Times New Roman"/>
+        </w:rPr>
+        <w:t>Type</w:t>
       </w:r>
       <w:r>
         <w:rPr>
@@ -131,6 +195,13 @@
         </w:rPr>
         <w:t>:</w:t>
       </w:r>
+      <w:r>
+        <w:rPr>
+          <w:rFonts w:ascii="Times New Roman" w:hAnsi="Times New Roman" w:cs="Times New Roman"/>
+        </w:rPr>
+        <w:t>Retail</w:t>
+      </w:r>
+      <w:proofErr w:type="spellEnd"/>
     </w:p>
     <w:p>
       <w:pPr>
@@ -144,12 +215,20 @@
         </w:rPr>
         <w:t xml:space="preserve">Who handles </w:t>
       </w:r>
+      <w:proofErr w:type="spellStart"/>
       <w:r>
         <w:rPr>
           <w:rFonts w:ascii="Times New Roman" w:hAnsi="Times New Roman" w:cs="Times New Roman"/>
         </w:rPr>
         <w:t>GST:</w:t>
       </w:r>
+      <w:r>
+        <w:rPr>
+          <w:rFonts w:ascii="Times New Roman" w:hAnsi="Times New Roman" w:cs="Times New Roman"/>
+        </w:rPr>
+        <w:t>Accountant</w:t>
+      </w:r>
+      <w:proofErr w:type="spellEnd"/>
     </w:p>
     <w:p>
       <w:pPr>
@@ -172,6 +251,85 @@
     </w:p>
     <w:p>
       <w:pPr>
+        <w:ind w:left="1440"/>
+        <w:rPr>
+          <w:rFonts w:ascii="Times New Roman" w:hAnsi="Times New Roman" w:cs="Times New Roman"/>
+        </w:rPr>
+      </w:pPr>
+      <w:r>
+        <w:rPr>
+          <w:rFonts w:ascii="Times New Roman" w:hAnsi="Times New Roman" w:cs="Times New Roman"/>
+        </w:rPr>
+        <w:t xml:space="preserve">• Shop owner collects many bills but does not check them properly </w:t>
+      </w:r>
+      <w:r>
+        <w:rPr>
+          <w:rFonts w:ascii="Times New Roman" w:hAnsi="Times New Roman" w:cs="Times New Roman"/>
+        </w:rPr>
+        <w:br/>
+      </w:r>
+      <w:r>
+        <w:rPr>
+          <w:rFonts w:ascii="Times New Roman" w:hAnsi="Times New Roman" w:cs="Times New Roman"/>
+        </w:rPr>
+        <w:br/>
+        <w:t xml:space="preserve">• Bills are given to accountant without organizing, causing confusion </w:t>
+      </w:r>
+      <w:r>
+        <w:rPr>
+          <w:rFonts w:ascii="Times New Roman" w:hAnsi="Times New Roman" w:cs="Times New Roman"/>
+        </w:rPr>
+        <w:br/>
+      </w:r>
+      <w:r>
+        <w:rPr>
+          <w:rFonts w:ascii="Times New Roman" w:hAnsi="Times New Roman" w:cs="Times New Roman"/>
+        </w:rPr>
+        <w:br/>
+        <w:t xml:space="preserve">• Difficult to know if any bill is missing before giving to accountant </w:t>
+      </w:r>
+      <w:r>
+        <w:rPr>
+          <w:rFonts w:ascii="Times New Roman" w:hAnsi="Times New Roman" w:cs="Times New Roman"/>
+        </w:rPr>
+        <w:br/>
+      </w:r>
+      <w:r>
+        <w:rPr>
+          <w:rFonts w:ascii="Times New Roman" w:hAnsi="Times New Roman" w:cs="Times New Roman"/>
+        </w:rPr>
+        <w:br/>
+        <w:t xml:space="preserve">• Owner cannot easily understand GST details in the bills </w:t>
+      </w:r>
+      <w:r>
+        <w:rPr>
+          <w:rFonts w:ascii="Times New Roman" w:hAnsi="Times New Roman" w:cs="Times New Roman"/>
+        </w:rPr>
+        <w:br/>
+      </w:r>
+      <w:r>
+        <w:rPr>
+          <w:rFonts w:ascii="Times New Roman" w:hAnsi="Times New Roman" w:cs="Times New Roman"/>
+        </w:rPr>
+        <w:br/>
+        <w:t xml:space="preserve">• No way to track daily expenses and purchases clearly </w:t>
+      </w:r>
+      <w:r>
+        <w:rPr>
+          <w:rFonts w:ascii="Times New Roman" w:hAnsi="Times New Roman" w:cs="Times New Roman"/>
+        </w:rPr>
+        <w:br/>
+      </w:r>
+      <w:r>
+        <w:rPr>
+          <w:rFonts w:ascii="Times New Roman" w:hAnsi="Times New Roman" w:cs="Times New Roman"/>
+        </w:rPr>
+        <w:br/>
+        <w:t>• Sometimes wrong or incomplete bills are submitted unknowingly</w:t>
+      </w:r>
+    </w:p>
+    <w:p>
+      <w:pPr>
         <w:rPr>
           <w:rFonts w:ascii="Times New Roman" w:hAnsi="Times New Roman" w:cs="Times New Roman"/>
         </w:rPr>
@@ -195,9 +353,8 @@
         <w:rPr>
           <w:noProof/>
         </w:rPr>
-        <w:lastRenderedPageBreak/>
         <w:drawing>
-          <wp:inline distT="0" distB="0" distL="0" distR="0" wp14:anchorId="65353270" wp14:editId="2704F417">
+          <wp:inline distT="0" distB="0" distL="0" distR="0" wp14:anchorId="65353270" wp14:editId="2A0601E4">
             <wp:extent cx="5382491" cy="3758082"/>
             <wp:effectExtent l="0" t="0" r="8890" b="0"/>
             <wp:docPr id="1752227527" name="Picture 2"/>
@@ -370,7 +527,7 @@
         </w:rPr>
         <w:lastRenderedPageBreak/>
         <w:drawing>
-          <wp:inline distT="0" distB="0" distL="0" distR="0" wp14:anchorId="39E25056" wp14:editId="4712604B">
+          <wp:inline distT="0" distB="0" distL="0" distR="0" wp14:anchorId="39E25056" wp14:editId="3D0CAAEC">
             <wp:extent cx="5392074" cy="4044354"/>
             <wp:effectExtent l="0" t="0" r="0" b="0"/>
             <wp:docPr id="370830020" name="Picture 3"/>
@@ -461,132 +618,120 @@
         <w:rPr>
           <w:rFonts w:ascii="Times New Roman" w:hAnsi="Times New Roman" w:cs="Times New Roman"/>
         </w:rPr>
+        <w:t xml:space="preserve"> Limbu-Chilli Restaurant</w:t>
+      </w:r>
+    </w:p>
+    <w:p>
+      <w:pPr>
+        <w:rPr>
+          <w:rFonts w:ascii="Times New Roman" w:hAnsi="Times New Roman" w:cs="Times New Roman"/>
+        </w:rPr>
+      </w:pPr>
+      <w:r>
+        <w:rPr>
+          <w:rFonts w:ascii="Times New Roman" w:hAnsi="Times New Roman" w:cs="Times New Roman"/>
+        </w:rPr>
+        <w:t>Role</w:t>
+      </w:r>
+      <w:r>
+        <w:rPr>
+          <w:rFonts w:ascii="Times New Roman" w:hAnsi="Times New Roman" w:cs="Times New Roman"/>
+        </w:rPr>
+        <w:t>:</w:t>
+      </w:r>
+      <w:r>
+        <w:rPr>
+          <w:rFonts w:ascii="Times New Roman" w:hAnsi="Times New Roman" w:cs="Times New Roman"/>
+        </w:rPr>
+        <w:t xml:space="preserve"> Owner</w:t>
+      </w:r>
+    </w:p>
+    <w:p>
+      <w:pPr>
+        <w:rPr>
+          <w:rFonts w:ascii="Times New Roman" w:hAnsi="Times New Roman" w:cs="Times New Roman"/>
+        </w:rPr>
+      </w:pPr>
+      <w:r>
+        <w:rPr>
+          <w:rFonts w:ascii="Times New Roman" w:hAnsi="Times New Roman" w:cs="Times New Roman"/>
+        </w:rPr>
+        <w:t>Business Type</w:t>
+      </w:r>
+      <w:r>
+        <w:rPr>
+          <w:rFonts w:ascii="Times New Roman" w:hAnsi="Times New Roman" w:cs="Times New Roman"/>
+        </w:rPr>
+        <w:t>:</w:t>
+      </w:r>
+      <w:r>
+        <w:rPr>
+          <w:rFonts w:ascii="Times New Roman" w:hAnsi="Times New Roman" w:cs="Times New Roman"/>
+        </w:rPr>
+        <w:t xml:space="preserve"> Small Restaurant</w:t>
+      </w:r>
+    </w:p>
+    <w:p>
+      <w:pPr>
+        <w:rPr>
+          <w:rFonts w:ascii="Times New Roman" w:hAnsi="Times New Roman" w:cs="Times New Roman"/>
+        </w:rPr>
+      </w:pPr>
+      <w:r>
+        <w:rPr>
+          <w:rFonts w:ascii="Times New Roman" w:hAnsi="Times New Roman" w:cs="Times New Roman"/>
+        </w:rPr>
+        <w:t xml:space="preserve">Who handles </w:t>
+      </w:r>
+      <w:r>
+        <w:rPr>
+          <w:rFonts w:ascii="Times New Roman" w:hAnsi="Times New Roman" w:cs="Times New Roman"/>
+        </w:rPr>
+        <w:t>GST:</w:t>
+      </w:r>
+      <w:r>
+        <w:rPr>
+          <w:rFonts w:ascii="Times New Roman" w:hAnsi="Times New Roman" w:cs="Times New Roman"/>
+        </w:rPr>
+        <w:t xml:space="preserve"> Accountant(sometimes owner also involved)</w:t>
+      </w:r>
+    </w:p>
+    <w:p>
+      <w:pPr>
+        <w:rPr>
+          <w:rFonts w:ascii="Times New Roman" w:hAnsi="Times New Roman" w:cs="Times New Roman"/>
+        </w:rPr>
+      </w:pPr>
+      <w:r>
+        <w:rPr>
+          <w:rFonts w:ascii="Times New Roman" w:hAnsi="Times New Roman" w:cs="Times New Roman"/>
+        </w:rPr>
+        <w:t>Pain points</w:t>
+      </w:r>
+      <w:r>
+        <w:rPr>
+          <w:rFonts w:ascii="Times New Roman" w:hAnsi="Times New Roman" w:cs="Times New Roman"/>
+        </w:rPr>
+        <w:t>:</w:t>
+      </w:r>
+      <w:r>
+        <w:rPr>
+          <w:rFonts w:ascii="Times New Roman" w:hAnsi="Times New Roman" w:cs="Times New Roman"/>
+        </w:rPr>
         <w:t xml:space="preserve"> </w:t>
       </w:r>
-      <w:r>
-        <w:rPr>
-          <w:rFonts w:ascii="Times New Roman" w:hAnsi="Times New Roman" w:cs="Times New Roman"/>
-        </w:rPr>
-        <w:t>Limbu-Chilli Restaurant</w:t>
-      </w:r>
-    </w:p>
-    <w:p>
-      <w:pPr>
-        <w:rPr>
-          <w:rFonts w:ascii="Times New Roman" w:hAnsi="Times New Roman" w:cs="Times New Roman"/>
-        </w:rPr>
-      </w:pPr>
-      <w:r>
-        <w:rPr>
-          <w:rFonts w:ascii="Times New Roman" w:hAnsi="Times New Roman" w:cs="Times New Roman"/>
-        </w:rPr>
-        <w:t>Role</w:t>
-      </w:r>
-      <w:r>
-        <w:rPr>
-          <w:rFonts w:ascii="Times New Roman" w:hAnsi="Times New Roman" w:cs="Times New Roman"/>
-        </w:rPr>
-        <w:t>:</w:t>
-      </w:r>
-      <w:r>
-        <w:rPr>
-          <w:rFonts w:ascii="Times New Roman" w:hAnsi="Times New Roman" w:cs="Times New Roman"/>
-        </w:rPr>
-        <w:t xml:space="preserve"> </w:t>
-      </w:r>
-      <w:r>
-        <w:rPr>
-          <w:rFonts w:ascii="Times New Roman" w:hAnsi="Times New Roman" w:cs="Times New Roman"/>
-        </w:rPr>
-        <w:t>Owner</w:t>
-      </w:r>
-    </w:p>
-    <w:p>
-      <w:pPr>
-        <w:rPr>
-          <w:rFonts w:ascii="Times New Roman" w:hAnsi="Times New Roman" w:cs="Times New Roman"/>
-        </w:rPr>
-      </w:pPr>
-      <w:r>
-        <w:rPr>
-          <w:rFonts w:ascii="Times New Roman" w:hAnsi="Times New Roman" w:cs="Times New Roman"/>
-        </w:rPr>
-        <w:t>Firm</w:t>
-      </w:r>
-      <w:r>
-        <w:rPr>
-          <w:rFonts w:ascii="Times New Roman" w:hAnsi="Times New Roman" w:cs="Times New Roman"/>
-        </w:rPr>
-        <w:t>:</w:t>
-      </w:r>
-      <w:r>
-        <w:rPr>
-          <w:rFonts w:ascii="Times New Roman" w:hAnsi="Times New Roman" w:cs="Times New Roman"/>
-        </w:rPr>
-        <w:t xml:space="preserve"> </w:t>
-      </w:r>
-      <w:r>
-        <w:rPr>
-          <w:rFonts w:ascii="Times New Roman" w:hAnsi="Times New Roman" w:cs="Times New Roman"/>
-        </w:rPr>
-        <w:t>Small Restaurant</w:t>
-      </w:r>
-    </w:p>
-    <w:p>
-      <w:pPr>
-        <w:rPr>
-          <w:rFonts w:ascii="Times New Roman" w:hAnsi="Times New Roman" w:cs="Times New Roman"/>
-        </w:rPr>
-      </w:pPr>
-      <w:r>
-        <w:rPr>
-          <w:rFonts w:ascii="Times New Roman" w:hAnsi="Times New Roman" w:cs="Times New Roman"/>
-        </w:rPr>
-        <w:t xml:space="preserve">Who handles </w:t>
-      </w:r>
-      <w:r>
-        <w:rPr>
-          <w:rFonts w:ascii="Times New Roman" w:hAnsi="Times New Roman" w:cs="Times New Roman"/>
-        </w:rPr>
-        <w:t>GST:</w:t>
-      </w:r>
-      <w:r>
-        <w:rPr>
-          <w:rFonts w:ascii="Times New Roman" w:hAnsi="Times New Roman" w:cs="Times New Roman"/>
-        </w:rPr>
-        <w:t xml:space="preserve"> </w:t>
-      </w:r>
-      <w:r>
-        <w:rPr>
-          <w:rFonts w:ascii="Times New Roman" w:hAnsi="Times New Roman" w:cs="Times New Roman"/>
-        </w:rPr>
-        <w:t>Accountant(sometimes owner also involved)</w:t>
-      </w:r>
-    </w:p>
-    <w:p>
-      <w:pPr>
-        <w:rPr>
-          <w:rFonts w:ascii="Times New Roman" w:hAnsi="Times New Roman" w:cs="Times New Roman"/>
-        </w:rPr>
-      </w:pPr>
-      <w:r>
-        <w:rPr>
-          <w:rFonts w:ascii="Times New Roman" w:hAnsi="Times New Roman" w:cs="Times New Roman"/>
-        </w:rPr>
-        <w:t>Pain points</w:t>
-      </w:r>
-      <w:r>
-        <w:rPr>
-          <w:rFonts w:ascii="Times New Roman" w:hAnsi="Times New Roman" w:cs="Times New Roman"/>
-        </w:rPr>
-        <w:t>:</w:t>
-      </w:r>
-      <w:r>
-        <w:rPr>
-          <w:rFonts w:ascii="Times New Roman" w:hAnsi="Times New Roman" w:cs="Times New Roman"/>
-        </w:rPr>
-        <w:t xml:space="preserve"> </w:t>
-      </w:r>
+    </w:p>
+    <w:p>
+      <w:pPr>
+        <w:pStyle w:val="ListParagraph"/>
+        <w:numPr>
+          <w:ilvl w:val="2"/>
+          <w:numId w:val="4"/>
+        </w:numPr>
+        <w:rPr>
+          <w:rFonts w:ascii="Times New Roman" w:hAnsi="Times New Roman" w:cs="Times New Roman"/>
+        </w:rPr>
+      </w:pPr>
       <w:r>
         <w:rPr>
           <w:rFonts w:ascii="Times New Roman" w:hAnsi="Times New Roman" w:cs="Times New Roman"/>
@@ -596,16 +741,15 @@
     </w:p>
     <w:p>
       <w:pPr>
-        <w:rPr>
-          <w:rFonts w:ascii="Times New Roman" w:hAnsi="Times New Roman" w:cs="Times New Roman"/>
-        </w:rPr>
-      </w:pPr>
-      <w:r>
-        <w:rPr>
-          <w:rFonts w:ascii="Times New Roman" w:hAnsi="Times New Roman" w:cs="Times New Roman"/>
-        </w:rPr>
-        <w:t xml:space="preserve">                     </w:t>
-      </w:r>
+        <w:pStyle w:val="ListParagraph"/>
+        <w:numPr>
+          <w:ilvl w:val="2"/>
+          <w:numId w:val="4"/>
+        </w:numPr>
+        <w:rPr>
+          <w:rFonts w:ascii="Times New Roman" w:hAnsi="Times New Roman" w:cs="Times New Roman"/>
+        </w:rPr>
+      </w:pPr>
       <w:r>
         <w:rPr>
           <w:rFonts w:ascii="Times New Roman" w:hAnsi="Times New Roman" w:cs="Times New Roman"/>
@@ -615,16 +759,15 @@
     </w:p>
     <w:p>
       <w:pPr>
-        <w:rPr>
-          <w:rFonts w:ascii="Times New Roman" w:hAnsi="Times New Roman" w:cs="Times New Roman"/>
-        </w:rPr>
-      </w:pPr>
-      <w:r>
-        <w:rPr>
-          <w:rFonts w:ascii="Times New Roman" w:hAnsi="Times New Roman" w:cs="Times New Roman"/>
-        </w:rPr>
-        <w:t xml:space="preserve">                     </w:t>
-      </w:r>
+        <w:pStyle w:val="ListParagraph"/>
+        <w:numPr>
+          <w:ilvl w:val="2"/>
+          <w:numId w:val="4"/>
+        </w:numPr>
+        <w:rPr>
+          <w:rFonts w:ascii="Times New Roman" w:hAnsi="Times New Roman" w:cs="Times New Roman"/>
+        </w:rPr>
+      </w:pPr>
       <w:r>
         <w:rPr>
           <w:rFonts w:ascii="Times New Roman" w:hAnsi="Times New Roman" w:cs="Times New Roman"/>
@@ -634,16 +777,15 @@
     </w:p>
     <w:p>
       <w:pPr>
-        <w:rPr>
-          <w:rFonts w:ascii="Times New Roman" w:hAnsi="Times New Roman" w:cs="Times New Roman"/>
-        </w:rPr>
-      </w:pPr>
-      <w:r>
-        <w:rPr>
-          <w:rFonts w:ascii="Times New Roman" w:hAnsi="Times New Roman" w:cs="Times New Roman"/>
-        </w:rPr>
-        <w:t xml:space="preserve">                     </w:t>
-      </w:r>
+        <w:pStyle w:val="ListParagraph"/>
+        <w:numPr>
+          <w:ilvl w:val="2"/>
+          <w:numId w:val="4"/>
+        </w:numPr>
+        <w:rPr>
+          <w:rFonts w:ascii="Times New Roman" w:hAnsi="Times New Roman" w:cs="Times New Roman"/>
+        </w:rPr>
+      </w:pPr>
       <w:r>
         <w:rPr>
           <w:rFonts w:ascii="Times New Roman" w:hAnsi="Times New Roman" w:cs="Times New Roman"/>
@@ -653,16 +795,15 @@
     </w:p>
     <w:p>
       <w:pPr>
-        <w:rPr>
-          <w:rFonts w:ascii="Times New Roman" w:hAnsi="Times New Roman" w:cs="Times New Roman"/>
-        </w:rPr>
-      </w:pPr>
-      <w:r>
-        <w:rPr>
-          <w:rFonts w:ascii="Times New Roman" w:hAnsi="Times New Roman" w:cs="Times New Roman"/>
-        </w:rPr>
-        <w:t xml:space="preserve">                     </w:t>
-      </w:r>
+        <w:pStyle w:val="ListParagraph"/>
+        <w:numPr>
+          <w:ilvl w:val="2"/>
+          <w:numId w:val="4"/>
+        </w:numPr>
+        <w:rPr>
+          <w:rFonts w:ascii="Times New Roman" w:hAnsi="Times New Roman" w:cs="Times New Roman"/>
+        </w:rPr>
+      </w:pPr>
       <w:r>
         <w:rPr>
           <w:rFonts w:ascii="Times New Roman" w:hAnsi="Times New Roman" w:cs="Times New Roman"/>
@@ -672,16 +813,15 @@
     </w:p>
     <w:p>
       <w:pPr>
-        <w:rPr>
-          <w:rFonts w:ascii="Times New Roman" w:hAnsi="Times New Roman" w:cs="Times New Roman"/>
-        </w:rPr>
-      </w:pPr>
-      <w:r>
-        <w:rPr>
-          <w:rFonts w:ascii="Times New Roman" w:hAnsi="Times New Roman" w:cs="Times New Roman"/>
-        </w:rPr>
-        <w:t xml:space="preserve">                     </w:t>
-      </w:r>
+        <w:pStyle w:val="ListParagraph"/>
+        <w:numPr>
+          <w:ilvl w:val="2"/>
+          <w:numId w:val="4"/>
+        </w:numPr>
+        <w:rPr>
+          <w:rFonts w:ascii="Times New Roman" w:hAnsi="Times New Roman" w:cs="Times New Roman"/>
+        </w:rPr>
+      </w:pPr>
       <w:r>
         <w:rPr>
           <w:rFonts w:ascii="Times New Roman" w:hAnsi="Times New Roman" w:cs="Times New Roman"/>
@@ -730,7 +870,7 @@
         </w:rPr>
         <w:lastRenderedPageBreak/>
         <w:drawing>
-          <wp:inline distT="0" distB="0" distL="0" distR="0" wp14:anchorId="7487BD66" wp14:editId="289DC16E">
+          <wp:inline distT="0" distB="0" distL="0" distR="0" wp14:anchorId="7487BD66" wp14:editId="2BD24779">
             <wp:extent cx="5662237" cy="4246991"/>
             <wp:effectExtent l="0" t="0" r="0" b="1270"/>
             <wp:docPr id="1539651962" name="Picture 4"/>
@@ -793,19 +933,55 @@
           <w:rFonts w:ascii="Times New Roman" w:hAnsi="Times New Roman" w:cs="Times New Roman"/>
         </w:rPr>
       </w:pPr>
+      <w:proofErr w:type="spellStart"/>
       <w:r>
         <w:rPr>
           <w:rFonts w:ascii="Times New Roman" w:hAnsi="Times New Roman" w:cs="Times New Roman"/>
         </w:rPr>
         <w:t>Name:</w:t>
       </w:r>
-    </w:p>
-    <w:p>
-      <w:pPr>
-        <w:rPr>
-          <w:rFonts w:ascii="Times New Roman" w:hAnsi="Times New Roman" w:cs="Times New Roman"/>
-        </w:rPr>
-      </w:pPr>
+      <w:r>
+        <w:rPr>
+          <w:rFonts w:ascii="Times New Roman" w:hAnsi="Times New Roman" w:cs="Times New Roman"/>
+        </w:rPr>
+        <w:t>Harish</w:t>
+      </w:r>
+      <w:proofErr w:type="spellEnd"/>
+    </w:p>
+    <w:p>
+      <w:pPr>
+        <w:rPr>
+          <w:rFonts w:ascii="Times New Roman" w:hAnsi="Times New Roman" w:cs="Times New Roman"/>
+        </w:rPr>
+      </w:pPr>
+      <w:r>
+        <w:rPr>
+          <w:rFonts w:ascii="Times New Roman" w:hAnsi="Times New Roman" w:cs="Times New Roman"/>
+        </w:rPr>
+        <w:t xml:space="preserve">Shop </w:t>
+      </w:r>
+      <w:proofErr w:type="spellStart"/>
+      <w:r>
+        <w:rPr>
+          <w:rFonts w:ascii="Times New Roman" w:hAnsi="Times New Roman" w:cs="Times New Roman"/>
+        </w:rPr>
+        <w:t>Name:Bangarpet</w:t>
+      </w:r>
+      <w:proofErr w:type="spellEnd"/>
+      <w:r>
+        <w:rPr>
+          <w:rFonts w:ascii="Times New Roman" w:hAnsi="Times New Roman" w:cs="Times New Roman"/>
+        </w:rPr>
+        <w:t xml:space="preserve"> chats</w:t>
+      </w:r>
+    </w:p>
+    <w:p>
+      <w:pPr>
+        <w:rPr>
+          <w:rFonts w:ascii="Times New Roman" w:hAnsi="Times New Roman" w:cs="Times New Roman"/>
+        </w:rPr>
+      </w:pPr>
+      <w:proofErr w:type="spellStart"/>
       <w:r>
         <w:rPr>
           <w:rFonts w:ascii="Times New Roman" w:hAnsi="Times New Roman" w:cs="Times New Roman"/>
@@ -818,18 +994,32 @@
         </w:rPr>
         <w:t>:</w:t>
       </w:r>
-    </w:p>
-    <w:p>
-      <w:pPr>
-        <w:rPr>
-          <w:rFonts w:ascii="Times New Roman" w:hAnsi="Times New Roman" w:cs="Times New Roman"/>
-        </w:rPr>
-      </w:pPr>
-      <w:r>
-        <w:rPr>
-          <w:rFonts w:ascii="Times New Roman" w:hAnsi="Times New Roman" w:cs="Times New Roman"/>
-        </w:rPr>
-        <w:t>Firm</w:t>
+      <w:r>
+        <w:rPr>
+          <w:rFonts w:ascii="Times New Roman" w:hAnsi="Times New Roman" w:cs="Times New Roman"/>
+        </w:rPr>
+        <w:t>Owner</w:t>
+      </w:r>
+      <w:proofErr w:type="spellEnd"/>
+    </w:p>
+    <w:p>
+      <w:pPr>
+        <w:rPr>
+          <w:rFonts w:ascii="Times New Roman" w:hAnsi="Times New Roman" w:cs="Times New Roman"/>
+        </w:rPr>
+      </w:pPr>
+      <w:r>
+        <w:rPr>
+          <w:rFonts w:ascii="Times New Roman" w:hAnsi="Times New Roman" w:cs="Times New Roman"/>
+        </w:rPr>
+        <w:t xml:space="preserve">Business </w:t>
+      </w:r>
+      <w:proofErr w:type="spellStart"/>
+      <w:r>
+        <w:rPr>
+          <w:rFonts w:ascii="Times New Roman" w:hAnsi="Times New Roman" w:cs="Times New Roman"/>
+        </w:rPr>
+        <w:t>Type</w:t>
       </w:r>
       <w:r>
         <w:rPr>
@@ -837,24 +1027,39 @@
         </w:rPr>
         <w:t>:</w:t>
       </w:r>
-    </w:p>
-    <w:p>
-      <w:pPr>
-        <w:rPr>
-          <w:rFonts w:ascii="Times New Roman" w:hAnsi="Times New Roman" w:cs="Times New Roman"/>
-        </w:rPr>
-      </w:pPr>
-      <w:r>
-        <w:rPr>
-          <w:rFonts w:ascii="Times New Roman" w:hAnsi="Times New Roman" w:cs="Times New Roman"/>
-        </w:rPr>
-        <w:t xml:space="preserve">Who handles </w:t>
-      </w:r>
-      <w:r>
-        <w:rPr>
-          <w:rFonts w:ascii="Times New Roman" w:hAnsi="Times New Roman" w:cs="Times New Roman"/>
-        </w:rPr>
-        <w:t>GST:</w:t>
+      <w:r>
+        <w:rPr>
+          <w:rFonts w:ascii="Times New Roman" w:hAnsi="Times New Roman" w:cs="Times New Roman"/>
+        </w:rPr>
+        <w:t>Chats</w:t>
+      </w:r>
+      <w:proofErr w:type="spellEnd"/>
+      <w:r>
+        <w:rPr>
+          <w:rFonts w:ascii="Times New Roman" w:hAnsi="Times New Roman" w:cs="Times New Roman"/>
+        </w:rPr>
+        <w:t xml:space="preserve"> shop</w:t>
+      </w:r>
+    </w:p>
+    <w:p>
+      <w:pPr>
+        <w:rPr>
+          <w:rFonts w:ascii="Times New Roman" w:hAnsi="Times New Roman" w:cs="Times New Roman"/>
+        </w:rPr>
+      </w:pPr>
+      <w:proofErr w:type="spellStart"/>
+      <w:r>
+        <w:rPr>
+          <w:rFonts w:ascii="Times New Roman" w:hAnsi="Times New Roman" w:cs="Times New Roman"/>
+        </w:rPr>
+        <w:t>GST:not</w:t>
+      </w:r>
+      <w:proofErr w:type="spellEnd"/>
+      <w:r>
+        <w:rPr>
+          <w:rFonts w:ascii="Times New Roman" w:hAnsi="Times New Roman" w:cs="Times New Roman"/>
+        </w:rPr>
+        <w:t xml:space="preserve"> applicable(IT filling is done)</w:t>
       </w:r>
     </w:p>
     <w:p>
@@ -874,6 +1079,72 @@
           <w:rFonts w:ascii="Times New Roman" w:hAnsi="Times New Roman" w:cs="Times New Roman"/>
         </w:rPr>
         <w:t>:</w:t>
+      </w:r>
+    </w:p>
+    <w:p>
+      <w:pPr>
+        <w:ind w:left="1440"/>
+        <w:rPr>
+          <w:rFonts w:ascii="Times New Roman" w:hAnsi="Times New Roman" w:cs="Times New Roman"/>
+        </w:rPr>
+      </w:pPr>
+      <w:r>
+        <w:rPr>
+          <w:rFonts w:ascii="Times New Roman" w:hAnsi="Times New Roman" w:cs="Times New Roman"/>
+        </w:rPr>
+        <w:t xml:space="preserve">• Owner finds it difficult to understand tax rules </w:t>
+      </w:r>
+      <w:r>
+        <w:rPr>
+          <w:rFonts w:ascii="Times New Roman" w:hAnsi="Times New Roman" w:cs="Times New Roman"/>
+        </w:rPr>
+        <w:br/>
+      </w:r>
+      <w:r>
+        <w:rPr>
+          <w:rFonts w:ascii="Times New Roman" w:hAnsi="Times New Roman" w:cs="Times New Roman"/>
+        </w:rPr>
+        <w:br/>
+        <w:t xml:space="preserve">• Not sure how to calculate total income correctly </w:t>
+      </w:r>
+      <w:r>
+        <w:rPr>
+          <w:rFonts w:ascii="Times New Roman" w:hAnsi="Times New Roman" w:cs="Times New Roman"/>
+        </w:rPr>
+        <w:br/>
+      </w:r>
+      <w:r>
+        <w:rPr>
+          <w:rFonts w:ascii="Times New Roman" w:hAnsi="Times New Roman" w:cs="Times New Roman"/>
+        </w:rPr>
+        <w:br/>
+        <w:t xml:space="preserve">• Difficulty in maintaining proper records of income and expenses </w:t>
+      </w:r>
+      <w:r>
+        <w:rPr>
+          <w:rFonts w:ascii="Times New Roman" w:hAnsi="Times New Roman" w:cs="Times New Roman"/>
+        </w:rPr>
+        <w:br/>
+      </w:r>
+      <w:r>
+        <w:rPr>
+          <w:rFonts w:ascii="Times New Roman" w:hAnsi="Times New Roman" w:cs="Times New Roman"/>
+        </w:rPr>
+        <w:br/>
+        <w:t xml:space="preserve">• Fear of making mistakes while filing </w:t>
+      </w:r>
+      <w:r>
+        <w:rPr>
+          <w:rFonts w:ascii="Times New Roman" w:hAnsi="Times New Roman" w:cs="Times New Roman"/>
+        </w:rPr>
+        <w:br/>
+      </w:r>
+      <w:r>
+        <w:rPr>
+          <w:rFonts w:ascii="Times New Roman" w:hAnsi="Times New Roman" w:cs="Times New Roman"/>
+        </w:rPr>
+        <w:br/>
+        <w:t>• Time-consuming to organize data for filing</w:t>
       </w:r>
     </w:p>
     <w:p>
@@ -903,7 +1174,7 @@
         </w:rPr>
         <w:lastRenderedPageBreak/>
         <w:drawing>
-          <wp:inline distT="0" distB="0" distL="0" distR="0" wp14:anchorId="00BAF3E6" wp14:editId="1FB61DB1">
+          <wp:inline distT="0" distB="0" distL="0" distR="0" wp14:anchorId="00BAF3E6" wp14:editId="3DE24087">
             <wp:extent cx="5555673" cy="4169525"/>
             <wp:effectExtent l="0" t="0" r="6985" b="2540"/>
             <wp:docPr id="203539064" name="Picture 5"/>
@@ -1111,27 +1382,13 @@
         <w:rPr>
           <w:rFonts w:ascii="Times New Roman" w:hAnsi="Times New Roman" w:cs="Times New Roman"/>
         </w:rPr>
-        <w:t xml:space="preserve"> the help </w:t>
-      </w:r>
-      <w:proofErr w:type="gramStart"/>
-      <w:r>
-        <w:rPr>
-          <w:rFonts w:ascii="Times New Roman" w:hAnsi="Times New Roman" w:cs="Times New Roman"/>
-        </w:rPr>
-        <w:t xml:space="preserve">of </w:t>
-      </w:r>
-      <w:r>
-        <w:rPr>
-          <w:rFonts w:ascii="Times New Roman" w:hAnsi="Times New Roman" w:cs="Times New Roman"/>
-        </w:rPr>
-        <w:t xml:space="preserve"> external</w:t>
-      </w:r>
-      <w:proofErr w:type="gramEnd"/>
-      <w:r>
-        <w:rPr>
-          <w:rFonts w:ascii="Times New Roman" w:hAnsi="Times New Roman" w:cs="Times New Roman"/>
-        </w:rPr>
-        <w:t xml:space="preserve"> CA support</w:t>
+        <w:t xml:space="preserve"> the help of </w:t>
+      </w:r>
+      <w:r>
+        <w:rPr>
+          <w:rFonts w:ascii="Times New Roman" w:hAnsi="Times New Roman" w:cs="Times New Roman"/>
+        </w:rPr>
+        <w:t xml:space="preserve"> external CA support</w:t>
       </w:r>
     </w:p>
     <w:p>
@@ -1317,7 +1574,7 @@
           <w:noProof/>
         </w:rPr>
         <w:drawing>
-          <wp:inline distT="0" distB="0" distL="0" distR="0" wp14:anchorId="15EA7CF4" wp14:editId="6F07F7B0">
+          <wp:inline distT="0" distB="0" distL="0" distR="0" wp14:anchorId="15EA7CF4" wp14:editId="43195518">
             <wp:extent cx="5638800" cy="4229412"/>
             <wp:effectExtent l="0" t="0" r="0" b="0"/>
             <wp:docPr id="191003069" name="Picture 11"/>
@@ -1430,7 +1687,6 @@
         </w:rPr>
         <w:t xml:space="preserve"> </w:t>
       </w:r>
-      <w:proofErr w:type="gramStart"/>
       <w:r>
         <w:rPr>
           <w:rFonts w:ascii="Times New Roman" w:hAnsi="Times New Roman" w:cs="Times New Roman"/>
@@ -1441,14 +1697,7 @@
         <w:rPr>
           <w:rFonts w:ascii="Times New Roman" w:hAnsi="Times New Roman" w:cs="Times New Roman"/>
         </w:rPr>
-        <w:t>Door</w:t>
-      </w:r>
-      <w:proofErr w:type="gramEnd"/>
-      <w:r>
-        <w:rPr>
-          <w:rFonts w:ascii="Times New Roman" w:hAnsi="Times New Roman" w:cs="Times New Roman"/>
-        </w:rPr>
-        <w:t xml:space="preserve"> Locks </w:t>
+        <w:t xml:space="preserve">Door Locks </w:t>
       </w:r>
       <w:r>
         <w:rPr>
@@ -1656,7 +1905,7 @@
         </w:rPr>
         <w:lastRenderedPageBreak/>
         <w:drawing>
-          <wp:inline distT="0" distB="0" distL="0" distR="0" wp14:anchorId="6D82865C" wp14:editId="37205920">
+          <wp:inline distT="0" distB="0" distL="0" distR="0" wp14:anchorId="6D82865C" wp14:editId="738EA9E9">
             <wp:extent cx="5611091" cy="4211116"/>
             <wp:effectExtent l="0" t="0" r="8890" b="0"/>
             <wp:docPr id="520406503" name="Picture 12"/>
@@ -1751,7 +2000,6 @@
         <w:t xml:space="preserve">Shop </w:t>
       </w:r>
       <w:proofErr w:type="spellStart"/>
-      <w:proofErr w:type="gramStart"/>
       <w:r>
         <w:rPr>
           <w:rFonts w:ascii="Times New Roman" w:hAnsi="Times New Roman" w:cs="Times New Roman"/>
@@ -1765,7 +2013,6 @@
         <w:t>Aditya</w:t>
       </w:r>
       <w:proofErr w:type="spellEnd"/>
-      <w:proofErr w:type="gramEnd"/>
       <w:r>
         <w:rPr>
           <w:rFonts w:ascii="Times New Roman" w:hAnsi="Times New Roman" w:cs="Times New Roman"/>
@@ -2069,9 +2316,9 @@
     </w:lvl>
   </w:abstractNum>
   <w:abstractNum w:abstractNumId="1" w15:restartNumberingAfterBreak="0">
-    <w:nsid w:val="5B382DD6"/>
+    <w:nsid w:val="171656CD"/>
     <w:multiLevelType w:val="hybridMultilevel"/>
-    <w:tmpl w:val="6BC6FD74"/>
+    <w:tmpl w:val="5C686878"/>
     <w:lvl w:ilvl="0" w:tplc="40090001">
       <w:start w:val="1"/>
       <w:numFmt w:val="bullet"/>
@@ -2096,7 +2343,7 @@
         <w:rFonts w:ascii="Courier New" w:hAnsi="Courier New" w:cs="Courier New" w:hint="default"/>
       </w:rPr>
     </w:lvl>
-    <w:lvl w:ilvl="2" w:tplc="40090005" w:tentative="1">
+    <w:lvl w:ilvl="2" w:tplc="40090005">
       <w:start w:val="1"/>
       <w:numFmt w:val="bullet"/>
       <w:lvlText w:val=""/>
@@ -2182,9 +2429,9 @@
     </w:lvl>
   </w:abstractNum>
   <w:abstractNum w:abstractNumId="2" w15:restartNumberingAfterBreak="0">
-    <w:nsid w:val="620E6DE8"/>
+    <w:nsid w:val="5B382DD6"/>
     <w:multiLevelType w:val="hybridMultilevel"/>
-    <w:tmpl w:val="5D32A5A6"/>
+    <w:tmpl w:val="6BC6FD74"/>
     <w:lvl w:ilvl="0" w:tplc="40090001">
       <w:start w:val="1"/>
       <w:numFmt w:val="bullet"/>
@@ -2294,14 +2541,130 @@
       </w:rPr>
     </w:lvl>
   </w:abstractNum>
+  <w:abstractNum w:abstractNumId="3" w15:restartNumberingAfterBreak="0">
+    <w:nsid w:val="620E6DE8"/>
+    <w:multiLevelType w:val="hybridMultilevel"/>
+    <w:tmpl w:val="5D32A5A6"/>
+    <w:lvl w:ilvl="0" w:tplc="40090001">
+      <w:start w:val="1"/>
+      <w:numFmt w:val="bullet"/>
+      <w:lvlText w:val=""/>
+      <w:lvlJc w:val="left"/>
+      <w:pPr>
+        <w:ind w:left="720" w:hanging="360"/>
+      </w:pPr>
+      <w:rPr>
+        <w:rFonts w:ascii="Symbol" w:hAnsi="Symbol" w:hint="default"/>
+      </w:rPr>
+    </w:lvl>
+    <w:lvl w:ilvl="1" w:tplc="40090003" w:tentative="1">
+      <w:start w:val="1"/>
+      <w:numFmt w:val="bullet"/>
+      <w:lvlText w:val="o"/>
+      <w:lvlJc w:val="left"/>
+      <w:pPr>
+        <w:ind w:left="1440" w:hanging="360"/>
+      </w:pPr>
+      <w:rPr>
+        <w:rFonts w:ascii="Courier New" w:hAnsi="Courier New" w:cs="Courier New" w:hint="default"/>
+      </w:rPr>
+    </w:lvl>
+    <w:lvl w:ilvl="2" w:tplc="40090005" w:tentative="1">
+      <w:start w:val="1"/>
+      <w:numFmt w:val="bullet"/>
+      <w:lvlText w:val=""/>
+      <w:lvlJc w:val="left"/>
+      <w:pPr>
+        <w:ind w:left="2160" w:hanging="360"/>
+      </w:pPr>
+      <w:rPr>
+        <w:rFonts w:ascii="Wingdings" w:hAnsi="Wingdings" w:hint="default"/>
+      </w:rPr>
+    </w:lvl>
+    <w:lvl w:ilvl="3" w:tplc="40090001" w:tentative="1">
+      <w:start w:val="1"/>
+      <w:numFmt w:val="bullet"/>
+      <w:lvlText w:val=""/>
+      <w:lvlJc w:val="left"/>
+      <w:pPr>
+        <w:ind w:left="2880" w:hanging="360"/>
+      </w:pPr>
+      <w:rPr>
+        <w:rFonts w:ascii="Symbol" w:hAnsi="Symbol" w:hint="default"/>
+      </w:rPr>
+    </w:lvl>
+    <w:lvl w:ilvl="4" w:tplc="40090003" w:tentative="1">
+      <w:start w:val="1"/>
+      <w:numFmt w:val="bullet"/>
+      <w:lvlText w:val="o"/>
+      <w:lvlJc w:val="left"/>
+      <w:pPr>
+        <w:ind w:left="3600" w:hanging="360"/>
+      </w:pPr>
+      <w:rPr>
+        <w:rFonts w:ascii="Courier New" w:hAnsi="Courier New" w:cs="Courier New" w:hint="default"/>
+      </w:rPr>
+    </w:lvl>
+    <w:lvl w:ilvl="5" w:tplc="40090005" w:tentative="1">
+      <w:start w:val="1"/>
+      <w:numFmt w:val="bullet"/>
+      <w:lvlText w:val=""/>
+      <w:lvlJc w:val="left"/>
+      <w:pPr>
+        <w:ind w:left="4320" w:hanging="360"/>
+      </w:pPr>
+      <w:rPr>
+        <w:rFonts w:ascii="Wingdings" w:hAnsi="Wingdings" w:hint="default"/>
+      </w:rPr>
+    </w:lvl>
+    <w:lvl w:ilvl="6" w:tplc="40090001" w:tentative="1">
+      <w:start w:val="1"/>
+      <w:numFmt w:val="bullet"/>
+      <w:lvlText w:val=""/>
+      <w:lvlJc w:val="left"/>
+      <w:pPr>
+        <w:ind w:left="5040" w:hanging="360"/>
+      </w:pPr>
+      <w:rPr>
+        <w:rFonts w:ascii="Symbol" w:hAnsi="Symbol" w:hint="default"/>
+      </w:rPr>
+    </w:lvl>
+    <w:lvl w:ilvl="7" w:tplc="40090003" w:tentative="1">
+      <w:start w:val="1"/>
+      <w:numFmt w:val="bullet"/>
+      <w:lvlText w:val="o"/>
+      <w:lvlJc w:val="left"/>
+      <w:pPr>
+        <w:ind w:left="5760" w:hanging="360"/>
+      </w:pPr>
+      <w:rPr>
+        <w:rFonts w:ascii="Courier New" w:hAnsi="Courier New" w:cs="Courier New" w:hint="default"/>
+      </w:rPr>
+    </w:lvl>
+    <w:lvl w:ilvl="8" w:tplc="40090005" w:tentative="1">
+      <w:start w:val="1"/>
+      <w:numFmt w:val="bullet"/>
+      <w:lvlText w:val=""/>
+      <w:lvlJc w:val="left"/>
+      <w:pPr>
+        <w:ind w:left="6480" w:hanging="360"/>
+      </w:pPr>
+      <w:rPr>
+        <w:rFonts w:ascii="Wingdings" w:hAnsi="Wingdings" w:hint="default"/>
+      </w:rPr>
+    </w:lvl>
+  </w:abstractNum>
   <w:num w:numId="1" w16cid:durableId="820925277">
-    <w:abstractNumId w:val="1"/>
+    <w:abstractNumId w:val="2"/>
   </w:num>
   <w:num w:numId="2" w16cid:durableId="1063799104">
-    <w:abstractNumId w:val="2"/>
+    <w:abstractNumId w:val="3"/>
   </w:num>
   <w:num w:numId="3" w16cid:durableId="885146815">
     <w:abstractNumId w:val="0"/>
+  </w:num>
+  <w:num w:numId="4" w16cid:durableId="449587930">
+    <w:abstractNumId w:val="1"/>
   </w:num>
 </w:numbering>
 </file>

</xml_diff>

<commit_message>
Added survey form and response link
</commit_message>
<xml_diff>
--- a/Documents/Customer Feedback Document.docx
+++ b/Documents/Customer Feedback Document.docx
@@ -26,7 +26,7 @@
           <w:noProof/>
         </w:rPr>
         <w:drawing>
-          <wp:inline distT="0" distB="0" distL="0" distR="0" wp14:anchorId="17799449" wp14:editId="21111C7E">
+          <wp:inline distT="0" distB="0" distL="0" distR="0" wp14:anchorId="17799449" wp14:editId="4E847E5C">
             <wp:extent cx="5237018" cy="3928056"/>
             <wp:effectExtent l="0" t="0" r="1905" b="0"/>
             <wp:docPr id="1081831846" name="Picture 1"/>
@@ -87,6 +87,7 @@
           <w:rFonts w:ascii="Times New Roman" w:hAnsi="Times New Roman" w:cs="Times New Roman"/>
         </w:rPr>
       </w:pPr>
+      <w:proofErr w:type="spellStart"/>
       <w:r>
         <w:rPr>
           <w:rFonts w:ascii="Times New Roman" w:hAnsi="Times New Roman" w:cs="Times New Roman"/>
@@ -99,32 +100,56 @@
         </w:rPr>
         <w:t>Ganesh</w:t>
       </w:r>
-    </w:p>
-    <w:p>
-      <w:pPr>
-        <w:rPr>
-          <w:rFonts w:ascii="Times New Roman" w:hAnsi="Times New Roman" w:cs="Times New Roman"/>
-        </w:rPr>
-      </w:pPr>
-      <w:r>
-        <w:rPr>
-          <w:rFonts w:ascii="Times New Roman" w:hAnsi="Times New Roman" w:cs="Times New Roman"/>
-        </w:rPr>
-        <w:t>Shop Name:</w:t>
-      </w:r>
-      <w:r>
-        <w:rPr>
-          <w:rFonts w:ascii="Times New Roman" w:hAnsi="Times New Roman" w:cs="Times New Roman"/>
-        </w:rPr>
-        <w:t>Aditya juice center</w:t>
-      </w:r>
-    </w:p>
-    <w:p>
-      <w:pPr>
-        <w:rPr>
-          <w:rFonts w:ascii="Times New Roman" w:hAnsi="Times New Roman" w:cs="Times New Roman"/>
-        </w:rPr>
-      </w:pPr>
+      <w:proofErr w:type="spellEnd"/>
+    </w:p>
+    <w:p>
+      <w:pPr>
+        <w:rPr>
+          <w:rFonts w:ascii="Times New Roman" w:hAnsi="Times New Roman" w:cs="Times New Roman"/>
+        </w:rPr>
+      </w:pPr>
+      <w:r>
+        <w:rPr>
+          <w:rFonts w:ascii="Times New Roman" w:hAnsi="Times New Roman" w:cs="Times New Roman"/>
+        </w:rPr>
+        <w:t xml:space="preserve">Shop </w:t>
+      </w:r>
+      <w:proofErr w:type="spellStart"/>
+      <w:r>
+        <w:rPr>
+          <w:rFonts w:ascii="Times New Roman" w:hAnsi="Times New Roman" w:cs="Times New Roman"/>
+        </w:rPr>
+        <w:t>Name:</w:t>
+      </w:r>
+      <w:r>
+        <w:rPr>
+          <w:rFonts w:ascii="Times New Roman" w:hAnsi="Times New Roman" w:cs="Times New Roman"/>
+        </w:rPr>
+        <w:t>Aditya</w:t>
+      </w:r>
+      <w:proofErr w:type="spellEnd"/>
+      <w:r>
+        <w:rPr>
+          <w:rFonts w:ascii="Times New Roman" w:hAnsi="Times New Roman" w:cs="Times New Roman"/>
+        </w:rPr>
+        <w:t xml:space="preserve"> juice </w:t>
+      </w:r>
+      <w:proofErr w:type="spellStart"/>
+      <w:r>
+        <w:rPr>
+          <w:rFonts w:ascii="Times New Roman" w:hAnsi="Times New Roman" w:cs="Times New Roman"/>
+        </w:rPr>
+        <w:t>center</w:t>
+      </w:r>
+      <w:proofErr w:type="spellEnd"/>
+    </w:p>
+    <w:p>
+      <w:pPr>
+        <w:rPr>
+          <w:rFonts w:ascii="Times New Roman" w:hAnsi="Times New Roman" w:cs="Times New Roman"/>
+        </w:rPr>
+      </w:pPr>
+      <w:proofErr w:type="spellStart"/>
       <w:r>
         <w:rPr>
           <w:rFonts w:ascii="Times New Roman" w:hAnsi="Times New Roman" w:cs="Times New Roman"/>
@@ -143,18 +168,26 @@
         </w:rPr>
         <w:t>Owner</w:t>
       </w:r>
-    </w:p>
-    <w:p>
-      <w:pPr>
-        <w:rPr>
-          <w:rFonts w:ascii="Times New Roman" w:hAnsi="Times New Roman" w:cs="Times New Roman"/>
-        </w:rPr>
-      </w:pPr>
-      <w:r>
-        <w:rPr>
-          <w:rFonts w:ascii="Times New Roman" w:hAnsi="Times New Roman" w:cs="Times New Roman"/>
-        </w:rPr>
-        <w:t>Business Type</w:t>
+      <w:proofErr w:type="spellEnd"/>
+    </w:p>
+    <w:p>
+      <w:pPr>
+        <w:rPr>
+          <w:rFonts w:ascii="Times New Roman" w:hAnsi="Times New Roman" w:cs="Times New Roman"/>
+        </w:rPr>
+      </w:pPr>
+      <w:r>
+        <w:rPr>
+          <w:rFonts w:ascii="Times New Roman" w:hAnsi="Times New Roman" w:cs="Times New Roman"/>
+        </w:rPr>
+        <w:t xml:space="preserve">Business </w:t>
+      </w:r>
+      <w:proofErr w:type="spellStart"/>
+      <w:r>
+        <w:rPr>
+          <w:rFonts w:ascii="Times New Roman" w:hAnsi="Times New Roman" w:cs="Times New Roman"/>
+        </w:rPr>
+        <w:t>Type</w:t>
       </w:r>
       <w:r>
         <w:rPr>
@@ -168,6 +201,7 @@
         </w:rPr>
         <w:t>Retail</w:t>
       </w:r>
+      <w:proofErr w:type="spellEnd"/>
     </w:p>
     <w:p>
       <w:pPr>
@@ -181,6 +215,7 @@
         </w:rPr>
         <w:t xml:space="preserve">Who handles </w:t>
       </w:r>
+      <w:proofErr w:type="spellStart"/>
       <w:r>
         <w:rPr>
           <w:rFonts w:ascii="Times New Roman" w:hAnsi="Times New Roman" w:cs="Times New Roman"/>
@@ -193,6 +228,7 @@
         </w:rPr>
         <w:t>Accountant</w:t>
       </w:r>
+      <w:proofErr w:type="spellEnd"/>
     </w:p>
     <w:p>
       <w:pPr>
@@ -318,7 +354,7 @@
           <w:noProof/>
         </w:rPr>
         <w:drawing>
-          <wp:inline distT="0" distB="0" distL="0" distR="0" wp14:anchorId="65353270" wp14:editId="68ABC77E">
+          <wp:inline distT="0" distB="0" distL="0" distR="0" wp14:anchorId="65353270" wp14:editId="3B307EFD">
             <wp:extent cx="5382491" cy="3758082"/>
             <wp:effectExtent l="0" t="0" r="8890" b="0"/>
             <wp:docPr id="1752227527" name="Picture 2"/>
@@ -381,6 +417,7 @@
           <w:rFonts w:ascii="Times New Roman" w:hAnsi="Times New Roman" w:cs="Times New Roman"/>
         </w:rPr>
       </w:pPr>
+      <w:proofErr w:type="spellStart"/>
       <w:r>
         <w:rPr>
           <w:rFonts w:ascii="Times New Roman" w:hAnsi="Times New Roman" w:cs="Times New Roman"/>
@@ -393,6 +430,7 @@
         </w:rPr>
         <w:t>Rizwan</w:t>
       </w:r>
+      <w:proofErr w:type="spellEnd"/>
     </w:p>
     <w:p>
       <w:pPr>
@@ -438,11 +476,19 @@
           <w:rFonts w:ascii="Times New Roman" w:hAnsi="Times New Roman" w:cs="Times New Roman"/>
         </w:rPr>
       </w:pPr>
-      <w:r>
-        <w:rPr>
-          <w:rFonts w:ascii="Times New Roman" w:hAnsi="Times New Roman" w:cs="Times New Roman"/>
-        </w:rPr>
-        <w:t>Bussiness Type</w:t>
+      <w:proofErr w:type="spellStart"/>
+      <w:r>
+        <w:rPr>
+          <w:rFonts w:ascii="Times New Roman" w:hAnsi="Times New Roman" w:cs="Times New Roman"/>
+        </w:rPr>
+        <w:t>Bussiness</w:t>
+      </w:r>
+      <w:proofErr w:type="spellEnd"/>
+      <w:r>
+        <w:rPr>
+          <w:rFonts w:ascii="Times New Roman" w:hAnsi="Times New Roman" w:cs="Times New Roman"/>
+        </w:rPr>
+        <w:t xml:space="preserve"> Type</w:t>
       </w:r>
       <w:r>
         <w:rPr>
@@ -651,7 +697,7 @@
         </w:rPr>
         <w:lastRenderedPageBreak/>
         <w:drawing>
-          <wp:inline distT="0" distB="0" distL="0" distR="0" wp14:anchorId="39E25056" wp14:editId="15BC022A">
+          <wp:inline distT="0" distB="0" distL="0" distR="0" wp14:anchorId="39E25056" wp14:editId="74DF724A">
             <wp:extent cx="5392074" cy="4044354"/>
             <wp:effectExtent l="0" t="0" r="0" b="0"/>
             <wp:docPr id="370830020" name="Picture 3"/>
@@ -994,7 +1040,7 @@
         </w:rPr>
         <w:lastRenderedPageBreak/>
         <w:drawing>
-          <wp:inline distT="0" distB="0" distL="0" distR="0" wp14:anchorId="7487BD66" wp14:editId="2DA45E22">
+          <wp:inline distT="0" distB="0" distL="0" distR="0" wp14:anchorId="7487BD66" wp14:editId="7E6146A0">
             <wp:extent cx="5662237" cy="4246991"/>
             <wp:effectExtent l="0" t="0" r="0" b="1270"/>
             <wp:docPr id="1539651962" name="Picture 4"/>
@@ -1057,6 +1103,7 @@
           <w:rFonts w:ascii="Times New Roman" w:hAnsi="Times New Roman" w:cs="Times New Roman"/>
         </w:rPr>
       </w:pPr>
+      <w:proofErr w:type="spellStart"/>
       <w:r>
         <w:rPr>
           <w:rFonts w:ascii="Times New Roman" w:hAnsi="Times New Roman" w:cs="Times New Roman"/>
@@ -1069,26 +1116,42 @@
         </w:rPr>
         <w:t>Harish</w:t>
       </w:r>
-    </w:p>
-    <w:p>
-      <w:pPr>
-        <w:rPr>
-          <w:rFonts w:ascii="Times New Roman" w:hAnsi="Times New Roman" w:cs="Times New Roman"/>
-        </w:rPr>
-      </w:pPr>
-      <w:r>
-        <w:rPr>
-          <w:rFonts w:ascii="Times New Roman" w:hAnsi="Times New Roman" w:cs="Times New Roman"/>
-        </w:rPr>
-        <w:t>Shop Name:Bangarpet chats</w:t>
-      </w:r>
-    </w:p>
-    <w:p>
-      <w:pPr>
-        <w:rPr>
-          <w:rFonts w:ascii="Times New Roman" w:hAnsi="Times New Roman" w:cs="Times New Roman"/>
-        </w:rPr>
-      </w:pPr>
+      <w:proofErr w:type="spellEnd"/>
+    </w:p>
+    <w:p>
+      <w:pPr>
+        <w:rPr>
+          <w:rFonts w:ascii="Times New Roman" w:hAnsi="Times New Roman" w:cs="Times New Roman"/>
+        </w:rPr>
+      </w:pPr>
+      <w:r>
+        <w:rPr>
+          <w:rFonts w:ascii="Times New Roman" w:hAnsi="Times New Roman" w:cs="Times New Roman"/>
+        </w:rPr>
+        <w:t xml:space="preserve">Shop </w:t>
+      </w:r>
+      <w:proofErr w:type="spellStart"/>
+      <w:r>
+        <w:rPr>
+          <w:rFonts w:ascii="Times New Roman" w:hAnsi="Times New Roman" w:cs="Times New Roman"/>
+        </w:rPr>
+        <w:t>Name:Bangarpet</w:t>
+      </w:r>
+      <w:proofErr w:type="spellEnd"/>
+      <w:r>
+        <w:rPr>
+          <w:rFonts w:ascii="Times New Roman" w:hAnsi="Times New Roman" w:cs="Times New Roman"/>
+        </w:rPr>
+        <w:t xml:space="preserve"> chats</w:t>
+      </w:r>
+    </w:p>
+    <w:p>
+      <w:pPr>
+        <w:rPr>
+          <w:rFonts w:ascii="Times New Roman" w:hAnsi="Times New Roman" w:cs="Times New Roman"/>
+        </w:rPr>
+      </w:pPr>
+      <w:proofErr w:type="spellStart"/>
       <w:r>
         <w:rPr>
           <w:rFonts w:ascii="Times New Roman" w:hAnsi="Times New Roman" w:cs="Times New Roman"/>
@@ -1107,18 +1170,26 @@
         </w:rPr>
         <w:t>Owner</w:t>
       </w:r>
-    </w:p>
-    <w:p>
-      <w:pPr>
-        <w:rPr>
-          <w:rFonts w:ascii="Times New Roman" w:hAnsi="Times New Roman" w:cs="Times New Roman"/>
-        </w:rPr>
-      </w:pPr>
-      <w:r>
-        <w:rPr>
-          <w:rFonts w:ascii="Times New Roman" w:hAnsi="Times New Roman" w:cs="Times New Roman"/>
-        </w:rPr>
-        <w:t>Business Type</w:t>
+      <w:proofErr w:type="spellEnd"/>
+    </w:p>
+    <w:p>
+      <w:pPr>
+        <w:rPr>
+          <w:rFonts w:ascii="Times New Roman" w:hAnsi="Times New Roman" w:cs="Times New Roman"/>
+        </w:rPr>
+      </w:pPr>
+      <w:r>
+        <w:rPr>
+          <w:rFonts w:ascii="Times New Roman" w:hAnsi="Times New Roman" w:cs="Times New Roman"/>
+        </w:rPr>
+        <w:t xml:space="preserve">Business </w:t>
+      </w:r>
+      <w:proofErr w:type="spellStart"/>
+      <w:r>
+        <w:rPr>
+          <w:rFonts w:ascii="Times New Roman" w:hAnsi="Times New Roman" w:cs="Times New Roman"/>
+        </w:rPr>
+        <w:t>Type</w:t>
       </w:r>
       <w:r>
         <w:rPr>
@@ -1130,20 +1201,35 @@
         <w:rPr>
           <w:rFonts w:ascii="Times New Roman" w:hAnsi="Times New Roman" w:cs="Times New Roman"/>
         </w:rPr>
-        <w:t>Chats shop</w:t>
-      </w:r>
-    </w:p>
-    <w:p>
-      <w:pPr>
-        <w:rPr>
-          <w:rFonts w:ascii="Times New Roman" w:hAnsi="Times New Roman" w:cs="Times New Roman"/>
-        </w:rPr>
-      </w:pPr>
-      <w:r>
-        <w:rPr>
-          <w:rFonts w:ascii="Times New Roman" w:hAnsi="Times New Roman" w:cs="Times New Roman"/>
-        </w:rPr>
-        <w:t>GST:not applicable(IT filling is done)</w:t>
+        <w:t>Chats</w:t>
+      </w:r>
+      <w:proofErr w:type="spellEnd"/>
+      <w:r>
+        <w:rPr>
+          <w:rFonts w:ascii="Times New Roman" w:hAnsi="Times New Roman" w:cs="Times New Roman"/>
+        </w:rPr>
+        <w:t xml:space="preserve"> shop</w:t>
+      </w:r>
+    </w:p>
+    <w:p>
+      <w:pPr>
+        <w:rPr>
+          <w:rFonts w:ascii="Times New Roman" w:hAnsi="Times New Roman" w:cs="Times New Roman"/>
+        </w:rPr>
+      </w:pPr>
+      <w:proofErr w:type="spellStart"/>
+      <w:r>
+        <w:rPr>
+          <w:rFonts w:ascii="Times New Roman" w:hAnsi="Times New Roman" w:cs="Times New Roman"/>
+        </w:rPr>
+        <w:t>GST:not</w:t>
+      </w:r>
+      <w:proofErr w:type="spellEnd"/>
+      <w:r>
+        <w:rPr>
+          <w:rFonts w:ascii="Times New Roman" w:hAnsi="Times New Roman" w:cs="Times New Roman"/>
+        </w:rPr>
+        <w:t xml:space="preserve"> applicable(IT filling is done)</w:t>
       </w:r>
     </w:p>
     <w:p>
@@ -1258,7 +1344,7 @@
         </w:rPr>
         <w:lastRenderedPageBreak/>
         <w:drawing>
-          <wp:inline distT="0" distB="0" distL="0" distR="0" wp14:anchorId="00BAF3E6" wp14:editId="45D23E14">
+          <wp:inline distT="0" distB="0" distL="0" distR="0" wp14:anchorId="00BAF3E6" wp14:editId="4AE6413B">
             <wp:extent cx="5555673" cy="4169525"/>
             <wp:effectExtent l="0" t="0" r="6985" b="2540"/>
             <wp:docPr id="203539064" name="Picture 5"/>
@@ -1349,11 +1435,19 @@
         </w:rPr>
         <w:t xml:space="preserve">Shop Name: </w:t>
       </w:r>
-      <w:r>
-        <w:rPr>
-          <w:rFonts w:ascii="Times New Roman" w:hAnsi="Times New Roman" w:cs="Times New Roman"/>
-        </w:rPr>
-        <w:t>GreenGadgets Computer Store</w:t>
+      <w:proofErr w:type="spellStart"/>
+      <w:r>
+        <w:rPr>
+          <w:rFonts w:ascii="Times New Roman" w:hAnsi="Times New Roman" w:cs="Times New Roman"/>
+        </w:rPr>
+        <w:t>GreenGadgets</w:t>
+      </w:r>
+      <w:proofErr w:type="spellEnd"/>
+      <w:r>
+        <w:rPr>
+          <w:rFonts w:ascii="Times New Roman" w:hAnsi="Times New Roman" w:cs="Times New Roman"/>
+        </w:rPr>
+        <w:t xml:space="preserve"> Computer Store</w:t>
       </w:r>
     </w:p>
     <w:p>
@@ -1650,7 +1744,7 @@
           <w:noProof/>
         </w:rPr>
         <w:drawing>
-          <wp:inline distT="0" distB="0" distL="0" distR="0" wp14:anchorId="15EA7CF4" wp14:editId="66C8F0FE">
+          <wp:inline distT="0" distB="0" distL="0" distR="0" wp14:anchorId="15EA7CF4" wp14:editId="0F0EEEA7">
             <wp:extent cx="5638800" cy="4229412"/>
             <wp:effectExtent l="0" t="0" r="0" b="0"/>
             <wp:docPr id="191003069" name="Picture 11"/>
@@ -1981,7 +2075,7 @@
         </w:rPr>
         <w:lastRenderedPageBreak/>
         <w:drawing>
-          <wp:inline distT="0" distB="0" distL="0" distR="0" wp14:anchorId="6D82865C" wp14:editId="7A71474B">
+          <wp:inline distT="0" distB="0" distL="0" distR="0" wp14:anchorId="6D82865C" wp14:editId="0319C7B4">
             <wp:extent cx="5611091" cy="4211116"/>
             <wp:effectExtent l="0" t="0" r="8890" b="0"/>
             <wp:docPr id="520406503" name="Picture 12"/>
@@ -2073,13 +2167,27 @@
         <w:rPr>
           <w:rFonts w:ascii="Times New Roman" w:hAnsi="Times New Roman" w:cs="Times New Roman"/>
         </w:rPr>
-        <w:t>Shop Name:</w:t>
-      </w:r>
-      <w:r>
-        <w:rPr>
-          <w:rFonts w:ascii="Times New Roman" w:hAnsi="Times New Roman" w:cs="Times New Roman"/>
-        </w:rPr>
-        <w:t>Aditya Pharmacy</w:t>
+        <w:t xml:space="preserve">Shop </w:t>
+      </w:r>
+      <w:proofErr w:type="spellStart"/>
+      <w:r>
+        <w:rPr>
+          <w:rFonts w:ascii="Times New Roman" w:hAnsi="Times New Roman" w:cs="Times New Roman"/>
+        </w:rPr>
+        <w:t>Name:</w:t>
+      </w:r>
+      <w:r>
+        <w:rPr>
+          <w:rFonts w:ascii="Times New Roman" w:hAnsi="Times New Roman" w:cs="Times New Roman"/>
+        </w:rPr>
+        <w:t>Aditya</w:t>
+      </w:r>
+      <w:proofErr w:type="spellEnd"/>
+      <w:r>
+        <w:rPr>
+          <w:rFonts w:ascii="Times New Roman" w:hAnsi="Times New Roman" w:cs="Times New Roman"/>
+        </w:rPr>
+        <w:t xml:space="preserve"> Pharmacy</w:t>
       </w:r>
     </w:p>
     <w:p>
@@ -2244,6 +2352,155 @@
         </w:rPr>
         <w:t>No automated billing system to track GST liability and ITC simultaneously</w:t>
       </w:r>
+    </w:p>
+    <w:p>
+      <w:pPr>
+        <w:rPr>
+          <w:rFonts w:ascii="Times New Roman" w:hAnsi="Times New Roman" w:cs="Times New Roman"/>
+        </w:rPr>
+      </w:pPr>
+    </w:p>
+    <w:p>
+      <w:pPr>
+        <w:rPr>
+          <w:rFonts w:ascii="Times New Roman" w:hAnsi="Times New Roman" w:cs="Times New Roman"/>
+        </w:rPr>
+      </w:pPr>
+    </w:p>
+    <w:p>
+      <w:pPr>
+        <w:rPr>
+          <w:rFonts w:ascii="Times New Roman" w:hAnsi="Times New Roman" w:cs="Times New Roman"/>
+          <w:b/>
+          <w:bCs/>
+          <w:sz w:val="28"/>
+          <w:szCs w:val="28"/>
+        </w:rPr>
+      </w:pPr>
+      <w:r>
+        <w:rPr>
+          <w:rFonts w:ascii="Times New Roman" w:hAnsi="Times New Roman" w:cs="Times New Roman"/>
+          <w:b/>
+          <w:bCs/>
+          <w:sz w:val="28"/>
+          <w:szCs w:val="28"/>
+        </w:rPr>
+        <w:t>Google form survey</w:t>
+      </w:r>
+    </w:p>
+    <w:p>
+      <w:pPr>
+        <w:rPr>
+          <w:rFonts w:ascii="Times New Roman" w:hAnsi="Times New Roman" w:cs="Times New Roman"/>
+          <w:b/>
+          <w:bCs/>
+          <w:sz w:val="28"/>
+          <w:szCs w:val="28"/>
+        </w:rPr>
+      </w:pPr>
+      <w:hyperlink r:id="rId12" w:history="1">
+        <w:r>
+          <w:rPr>
+            <w:rStyle w:val="Hyperlink"/>
+            <w:rFonts w:ascii="Times New Roman" w:hAnsi="Times New Roman" w:cs="Times New Roman"/>
+            <w:b/>
+            <w:bCs/>
+            <w:sz w:val="28"/>
+            <w:szCs w:val="28"/>
+          </w:rPr>
+          <w:t>survey for</w:t>
+        </w:r>
+        <w:r>
+          <w:rPr>
+            <w:rStyle w:val="Hyperlink"/>
+            <w:rFonts w:ascii="Times New Roman" w:hAnsi="Times New Roman" w:cs="Times New Roman"/>
+            <w:b/>
+            <w:bCs/>
+            <w:sz w:val="28"/>
+            <w:szCs w:val="28"/>
+          </w:rPr>
+          <w:t>m</w:t>
+        </w:r>
+        <w:r>
+          <w:rPr>
+            <w:rStyle w:val="Hyperlink"/>
+            <w:rFonts w:ascii="Times New Roman" w:hAnsi="Times New Roman" w:cs="Times New Roman"/>
+            <w:b/>
+            <w:bCs/>
+            <w:sz w:val="28"/>
+            <w:szCs w:val="28"/>
+          </w:rPr>
+          <w:t xml:space="preserve"> link</w:t>
+        </w:r>
+      </w:hyperlink>
+    </w:p>
+    <w:p>
+      <w:pPr>
+        <w:rPr>
+          <w:rFonts w:ascii="Times New Roman" w:hAnsi="Times New Roman" w:cs="Times New Roman"/>
+          <w:b/>
+          <w:bCs/>
+          <w:sz w:val="28"/>
+          <w:szCs w:val="28"/>
+        </w:rPr>
+      </w:pPr>
+      <w:hyperlink r:id="rId13" w:history="1">
+        <w:r>
+          <w:rPr>
+            <w:rStyle w:val="Hyperlink"/>
+            <w:rFonts w:ascii="Times New Roman" w:hAnsi="Times New Roman" w:cs="Times New Roman"/>
+            <w:b/>
+            <w:bCs/>
+            <w:sz w:val="28"/>
+            <w:szCs w:val="28"/>
+          </w:rPr>
+          <w:t>survey resp</w:t>
+        </w:r>
+        <w:r>
+          <w:rPr>
+            <w:rStyle w:val="Hyperlink"/>
+            <w:rFonts w:ascii="Times New Roman" w:hAnsi="Times New Roman" w:cs="Times New Roman"/>
+            <w:b/>
+            <w:bCs/>
+            <w:sz w:val="28"/>
+            <w:szCs w:val="28"/>
+          </w:rPr>
+          <w:t>o</w:t>
+        </w:r>
+        <w:r>
+          <w:rPr>
+            <w:rStyle w:val="Hyperlink"/>
+            <w:rFonts w:ascii="Times New Roman" w:hAnsi="Times New Roman" w:cs="Times New Roman"/>
+            <w:b/>
+            <w:bCs/>
+            <w:sz w:val="28"/>
+            <w:szCs w:val="28"/>
+          </w:rPr>
+          <w:t>nse</w:t>
+        </w:r>
+        <w:r>
+          <w:rPr>
+            <w:rStyle w:val="Hyperlink"/>
+            <w:rFonts w:ascii="Times New Roman" w:hAnsi="Times New Roman" w:cs="Times New Roman"/>
+            <w:b/>
+            <w:bCs/>
+            <w:sz w:val="28"/>
+            <w:szCs w:val="28"/>
+          </w:rPr>
+          <w:t xml:space="preserve"> </w:t>
+        </w:r>
+        <w:r>
+          <w:rPr>
+            <w:rStyle w:val="Hyperlink"/>
+            <w:rFonts w:ascii="Times New Roman" w:hAnsi="Times New Roman" w:cs="Times New Roman"/>
+            <w:b/>
+            <w:bCs/>
+            <w:sz w:val="28"/>
+            <w:szCs w:val="28"/>
+          </w:rPr>
+          <w:t>link</w:t>
+        </w:r>
+      </w:hyperlink>
     </w:p>
     <w:p>
       <w:pPr>
@@ -3996,6 +4253,41 @@
       <w:spacing w:val="5"/>
     </w:rPr>
   </w:style>
+  <w:style w:type="character" w:styleId="Hyperlink">
+    <w:name w:val="Hyperlink"/>
+    <w:basedOn w:val="DefaultParagraphFont"/>
+    <w:uiPriority w:val="99"/>
+    <w:unhideWhenUsed/>
+    <w:rsid w:val="00063400"/>
+    <w:rPr>
+      <w:color w:val="0563C1" w:themeColor="hyperlink"/>
+      <w:u w:val="single"/>
+    </w:rPr>
+  </w:style>
+  <w:style w:type="character" w:styleId="UnresolvedMention">
+    <w:name w:val="Unresolved Mention"/>
+    <w:basedOn w:val="DefaultParagraphFont"/>
+    <w:uiPriority w:val="99"/>
+    <w:semiHidden/>
+    <w:unhideWhenUsed/>
+    <w:rsid w:val="00063400"/>
+    <w:rPr>
+      <w:color w:val="605E5C"/>
+      <w:shd w:val="clear" w:color="auto" w:fill="E1DFDD"/>
+    </w:rPr>
+  </w:style>
+  <w:style w:type="character" w:styleId="FollowedHyperlink">
+    <w:name w:val="FollowedHyperlink"/>
+    <w:basedOn w:val="DefaultParagraphFont"/>
+    <w:uiPriority w:val="99"/>
+    <w:semiHidden/>
+    <w:unhideWhenUsed/>
+    <w:rsid w:val="00063400"/>
+    <w:rPr>
+      <w:color w:val="954F72" w:themeColor="followedHyperlink"/>
+      <w:u w:val="single"/>
+    </w:rPr>
+  </w:style>
 </w:styles>
 </file>
 

</xml_diff>